<commit_message>
cristopher: actualización de autoevaluación 1.3
</commit_message>
<xml_diff>
--- a/Entregables/Cristopher/Cristopher_Caniullan1.3_APT122_AutoevaluaciónFase1.docx
+++ b/Entregables/Cristopher/Cristopher_Caniullan1.3_APT122_AutoevaluaciónFase1.docx
@@ -65,6 +65,312 @@
         <w:rPr/>
       </w:pPr>
       <w:r>
+        <w:rPr>
+          <w:rtl w:val="0"/>
+        </w:rPr>
+      </w:r>
+    </w:p>
+    <w:p>
+      <w:pPr>
+        <w:rPr/>
+      </w:pPr>
+      <w:r>
+        <w:rPr>
+          <w:rtl w:val="0"/>
+        </w:rPr>
+      </w:r>
+    </w:p>
+    <w:p>
+      <w:pPr>
+        <w:rPr/>
+      </w:pPr>
+      <w:r>
+        <w:rPr>
+          <w:rtl w:val="0"/>
+        </w:rPr>
+      </w:r>
+    </w:p>
+    <w:p>
+      <w:pPr>
+        <w:rPr/>
+      </w:pPr>
+      <w:r>
+        <w:rPr>
+          <w:rtl w:val="0"/>
+        </w:rPr>
+      </w:r>
+    </w:p>
+    <w:p>
+      <w:pPr>
+        <w:rPr/>
+      </w:pPr>
+      <w:r>
+        <w:rPr>
+          <w:rtl w:val="0"/>
+        </w:rPr>
+      </w:r>
+    </w:p>
+    <w:p>
+      <w:pPr>
+        <w:rPr/>
+      </w:pPr>
+      <w:r>
+        <w:rPr>
+          <w:rtl w:val="0"/>
+        </w:rPr>
+      </w:r>
+    </w:p>
+    <w:p>
+      <w:pPr>
+        <w:rPr/>
+      </w:pPr>
+      <w:r>
+        <w:rPr>
+          <w:rtl w:val="0"/>
+        </w:rPr>
+      </w:r>
+    </w:p>
+    <w:p>
+      <w:pPr>
+        <w:rPr/>
+      </w:pPr>
+      <w:r>
+        <w:rPr>
+          <w:rtl w:val="0"/>
+        </w:rPr>
+      </w:r>
+    </w:p>
+    <w:p>
+      <w:pPr>
+        <w:rPr/>
+      </w:pPr>
+      <w:r>
+        <w:rPr>
+          <w:rtl w:val="0"/>
+        </w:rPr>
+      </w:r>
+    </w:p>
+    <w:p>
+      <w:pPr>
+        <w:rPr/>
+      </w:pPr>
+      <w:r>
+        <w:rPr>
+          <w:rtl w:val="0"/>
+        </w:rPr>
+      </w:r>
+    </w:p>
+    <w:p>
+      <w:pPr>
+        <w:rPr/>
+      </w:pPr>
+      <w:r>
+        <w:rPr>
+          <w:rtl w:val="0"/>
+        </w:rPr>
+      </w:r>
+    </w:p>
+    <w:p>
+      <w:pPr>
+        <w:rPr/>
+      </w:pPr>
+      <w:r>
+        <w:rPr>
+          <w:rtl w:val="0"/>
+        </w:rPr>
+      </w:r>
+    </w:p>
+    <w:p>
+      <w:pPr>
+        <w:rPr/>
+      </w:pPr>
+      <w:r>
+        <w:rPr>
+          <w:rtl w:val="0"/>
+        </w:rPr>
+      </w:r>
+    </w:p>
+    <w:p>
+      <w:pPr>
+        <w:rPr/>
+      </w:pPr>
+      <w:r>
+        <w:rPr>
+          <w:rtl w:val="0"/>
+        </w:rPr>
+      </w:r>
+    </w:p>
+    <w:p>
+      <w:pPr>
+        <w:rPr/>
+      </w:pPr>
+      <w:r>
+        <w:rPr>
+          <w:rtl w:val="0"/>
+        </w:rPr>
+      </w:r>
+    </w:p>
+    <w:p>
+      <w:pPr>
+        <w:rPr/>
+      </w:pPr>
+      <w:r>
+        <w:rPr>
+          <w:rtl w:val="0"/>
+        </w:rPr>
+      </w:r>
+    </w:p>
+    <w:p>
+      <w:pPr>
+        <w:rPr/>
+      </w:pPr>
+      <w:r>
+        <w:rPr>
+          <w:rtl w:val="0"/>
+        </w:rPr>
+      </w:r>
+    </w:p>
+    <w:p>
+      <w:pPr>
+        <w:rPr/>
+      </w:pPr>
+      <w:r>
+        <w:rPr>
+          <w:rtl w:val="0"/>
+        </w:rPr>
+      </w:r>
+    </w:p>
+    <w:p>
+      <w:pPr>
+        <w:rPr/>
+      </w:pPr>
+      <w:r>
+        <w:rPr>
+          <w:rtl w:val="0"/>
+        </w:rPr>
+      </w:r>
+    </w:p>
+    <w:p>
+      <w:pPr>
+        <w:rPr/>
+      </w:pPr>
+      <w:r>
+        <w:rPr>
+          <w:rtl w:val="0"/>
+        </w:rPr>
+      </w:r>
+    </w:p>
+    <w:p>
+      <w:pPr>
+        <w:rPr/>
+      </w:pPr>
+      <w:r>
+        <w:rPr>
+          <w:rtl w:val="0"/>
+        </w:rPr>
+      </w:r>
+    </w:p>
+    <w:p>
+      <w:pPr>
+        <w:rPr/>
+      </w:pPr>
+      <w:r>
+        <w:rPr>
+          <w:rtl w:val="0"/>
+        </w:rPr>
+      </w:r>
+    </w:p>
+    <w:p>
+      <w:pPr>
+        <w:rPr/>
+      </w:pPr>
+      <w:r>
+        <w:rPr>
+          <w:rtl w:val="0"/>
+        </w:rPr>
+      </w:r>
+    </w:p>
+    <w:p>
+      <w:pPr>
+        <w:rPr/>
+      </w:pPr>
+      <w:r>
+        <w:rPr>
+          <w:rtl w:val="0"/>
+        </w:rPr>
+      </w:r>
+    </w:p>
+    <w:p>
+      <w:pPr>
+        <w:rPr/>
+      </w:pPr>
+      <w:r>
+        <w:rPr>
+          <w:rtl w:val="0"/>
+        </w:rPr>
+      </w:r>
+    </w:p>
+    <w:p>
+      <w:pPr>
+        <w:rPr/>
+      </w:pPr>
+      <w:r>
+        <w:rPr>
+          <w:rtl w:val="0"/>
+        </w:rPr>
+      </w:r>
+    </w:p>
+    <w:p>
+      <w:pPr>
+        <w:rPr>
+          <w:sz w:val="24"/>
+          <w:szCs w:val="24"/>
+        </w:rPr>
+      </w:pPr>
+      <w:r>
+        <w:rPr>
+          <w:sz w:val="24"/>
+          <w:szCs w:val="24"/>
+          <w:rtl w:val="0"/>
+        </w:rPr>
+        <w:t xml:space="preserve">Nombre: Cristopher Andres Caniullan Carrasco</w:t>
+      </w:r>
+    </w:p>
+    <w:p>
+      <w:pPr>
+        <w:rPr>
+          <w:sz w:val="24"/>
+          <w:szCs w:val="24"/>
+        </w:rPr>
+      </w:pPr>
+      <w:r>
+        <w:rPr>
+          <w:rtl w:val="0"/>
+        </w:rPr>
+      </w:r>
+    </w:p>
+    <w:p>
+      <w:pPr>
+        <w:rPr/>
+      </w:pPr>
+      <w:r>
+        <w:rPr>
+          <w:sz w:val="24"/>
+          <w:szCs w:val="24"/>
+          <w:rtl w:val="0"/>
+        </w:rPr>
+        <w:t xml:space="preserve">Encargado de capstone: </w:t>
+      </w:r>
+      <w:r>
+        <w:rPr>
+          <w:color w:val="262626"/>
+          <w:sz w:val="24"/>
+          <w:szCs w:val="24"/>
+          <w:rtl w:val="0"/>
+        </w:rPr>
+        <w:t xml:space="preserve">FELIPE ANTONIO KRAUSS BENAVENTE</w:t>
+      </w:r>
+      <w:r>
         <w:br w:type="page"/>
       </w:r>
       <w:r>
@@ -75,7 +381,16 @@
     </w:p>
     <w:p>
       <w:pPr>
-        <w:spacing w:line="240" w:lineRule="auto"/>
+        <w:rPr/>
+      </w:pPr>
+      <w:r>
+        <w:rPr>
+          <w:rtl w:val="0"/>
+        </w:rPr>
+      </w:r>
+    </w:p>
+    <w:p>
+      <w:pPr>
         <w:rPr>
           <w:sz w:val="34"/>
           <w:szCs w:val="34"/>
@@ -83,26 +398,24 @@
       </w:pPr>
       <w:r>
         <w:rPr>
+          <w:rtl w:val="0"/>
+        </w:rPr>
+      </w:r>
+    </w:p>
+    <w:p>
+      <w:pPr>
+        <w:rPr>
           <w:sz w:val="34"/>
           <w:szCs w:val="34"/>
-          <w:rtl w:val="0"/>
-        </w:rPr>
-        <w:t xml:space="preserve">Introducción:</w:t>
-      </w:r>
-    </w:p>
-    <w:p>
-      <w:pPr>
-        <w:spacing w:line="240" w:lineRule="auto"/>
-        <w:jc w:val="both"/>
+        </w:rPr>
+      </w:pPr>
+      <w:r>
         <w:rPr>
           <w:sz w:val="34"/>
           <w:szCs w:val="34"/>
-        </w:rPr>
-      </w:pPr>
-      <w:r>
-        <w:rPr>
-          <w:rtl w:val="0"/>
-        </w:rPr>
+          <w:rtl w:val="0"/>
+        </w:rPr>
+        <w:t xml:space="preserve">Introducción:</w:t>
       </w:r>
     </w:p>
     <w:p>
@@ -110,6 +423,21 @@
         <w:spacing w:line="240" w:lineRule="auto"/>
         <w:jc w:val="both"/>
         <w:rPr>
+          <w:sz w:val="34"/>
+          <w:szCs w:val="34"/>
+        </w:rPr>
+      </w:pPr>
+      <w:r>
+        <w:rPr>
+          <w:rtl w:val="0"/>
+        </w:rPr>
+      </w:r>
+    </w:p>
+    <w:p>
+      <w:pPr>
+        <w:spacing w:line="240" w:lineRule="auto"/>
+        <w:jc w:val="both"/>
+        <w:rPr>
           <w:sz w:val="24"/>
           <w:szCs w:val="24"/>
         </w:rPr>
@@ -135,6 +463,21 @@
       <w:r>
         <w:br w:type="page"/>
       </w:r>
+      <w:r>
+        <w:rPr>
+          <w:rtl w:val="0"/>
+        </w:rPr>
+      </w:r>
+    </w:p>
+    <w:p>
+      <w:pPr>
+        <w:spacing w:line="240" w:lineRule="auto"/>
+        <w:jc w:val="both"/>
+        <w:rPr>
+          <w:sz w:val="34"/>
+          <w:szCs w:val="34"/>
+        </w:rPr>
+      </w:pPr>
       <w:r>
         <w:rPr>
           <w:rtl w:val="0"/>
@@ -449,12 +792,125 @@
       </w:r>
     </w:p>
     <w:sectPr>
+      <w:headerReference r:id="rId6" w:type="default"/>
+      <w:headerReference r:id="rId7" w:type="first"/>
       <w:pgSz w:h="16834" w:w="11909" w:orient="portrait"/>
       <w:pgMar w:bottom="1440" w:top="1440" w:left="1440" w:right="1440" w:header="720" w:footer="720"/>
-      <w:pgNumType w:start="1"/>
+      <w:pgNumType w:start="0"/>
     </w:sectPr>
   </w:body>
 </w:document>
+</file>
+
+<file path=word/header1.xml><?xml version="1.0" encoding="utf-8"?>
+<w:hdr xmlns:mc="http://schemas.openxmlformats.org/markup-compatibility/2006" xmlns:o="urn:schemas-microsoft-com:office:office" xmlns:r="http://schemas.openxmlformats.org/officeDocument/2006/relationships" xmlns:m="http://schemas.openxmlformats.org/officeDocument/2006/math" xmlns:v="urn:schemas-microsoft-com:vml" xmlns:wp="http://schemas.openxmlformats.org/drawingml/2006/wordprocessingDrawing" xmlns:w10="urn:schemas-microsoft-com:office:word" xmlns:w="http://schemas.openxmlformats.org/wordprocessingml/2006/main" xmlns:wne="http://schemas.microsoft.com/office/word/2006/wordml" xmlns:sl="http://schemas.openxmlformats.org/schemaLibrary/2006/main" xmlns:a="http://schemas.openxmlformats.org/drawingml/2006/main" xmlns:pic="http://schemas.openxmlformats.org/drawingml/2006/picture" xmlns:c="http://schemas.openxmlformats.org/drawingml/2006/chart" xmlns:lc="http://schemas.openxmlformats.org/drawingml/2006/lockedCanvas" xmlns:dgm="http://schemas.openxmlformats.org/drawingml/2006/diagram" xmlns:wps="http://schemas.microsoft.com/office/word/2010/wordprocessingShape" xmlns:wpg="http://schemas.microsoft.com/office/word/2010/wordprocessingGroup" xmlns:w14="http://schemas.microsoft.com/office/word/2010/wordml" xmlns:w15="http://schemas.microsoft.com/office/word/2012/wordml" xmlns:w16="http://schemas.microsoft.com/office/word/2018/wordml" xmlns:w16cex="http://schemas.microsoft.com/office/word/2018/wordml/cex" xmlns:w16cid="http://schemas.microsoft.com/office/word/2016/wordml/cid" xmlns="http://schemas.microsoft.com/office/tasks/2019/documenttasks" xmlns:cr="http://schemas.microsoft.com/office/comments/2020/reactions">
+  <w:p>
+    <w:pPr>
+      <w:jc w:val="left"/>
+      <w:rPr/>
+    </w:pPr>
+    <w:r>
+      <w:rPr/>
+      <w:drawing>
+        <wp:inline distB="114300" distT="114300" distL="114300" distR="114300">
+          <wp:extent cx="2072782" cy="509588"/>
+          <wp:effectExtent b="0" l="0" r="0" t="0"/>
+          <wp:docPr id="1" name="image1.png"/>
+          <a:graphic>
+            <a:graphicData uri="http://schemas.openxmlformats.org/drawingml/2006/picture">
+              <pic:pic>
+                <pic:nvPicPr>
+                  <pic:cNvPr id="0" name="image1.png"/>
+                  <pic:cNvPicPr preferRelativeResize="0"/>
+                </pic:nvPicPr>
+                <pic:blipFill>
+                  <a:blip r:embed="rId1"/>
+                  <a:srcRect b="0" l="0" r="0" t="0"/>
+                  <a:stretch>
+                    <a:fillRect/>
+                  </a:stretch>
+                </pic:blipFill>
+                <pic:spPr>
+                  <a:xfrm>
+                    <a:off x="0" y="0"/>
+                    <a:ext cx="2072782" cy="509588"/>
+                  </a:xfrm>
+                  <a:prstGeom prst="rect"/>
+                  <a:ln/>
+                </pic:spPr>
+              </pic:pic>
+            </a:graphicData>
+          </a:graphic>
+        </wp:inline>
+      </w:drawing>
+    </w:r>
+    <w:r>
+      <w:rPr>
+        <w:rtl w:val="0"/>
+      </w:rPr>
+    </w:r>
+  </w:p>
+</w:hdr>
+</file>
+
+<file path=word/header2.xml><?xml version="1.0" encoding="utf-8"?>
+<w:hdr xmlns:mc="http://schemas.openxmlformats.org/markup-compatibility/2006" xmlns:o="urn:schemas-microsoft-com:office:office" xmlns:r="http://schemas.openxmlformats.org/officeDocument/2006/relationships" xmlns:m="http://schemas.openxmlformats.org/officeDocument/2006/math" xmlns:v="urn:schemas-microsoft-com:vml" xmlns:wp="http://schemas.openxmlformats.org/drawingml/2006/wordprocessingDrawing" xmlns:w10="urn:schemas-microsoft-com:office:word" xmlns:w="http://schemas.openxmlformats.org/wordprocessingml/2006/main" xmlns:wne="http://schemas.microsoft.com/office/word/2006/wordml" xmlns:sl="http://schemas.openxmlformats.org/schemaLibrary/2006/main" xmlns:a="http://schemas.openxmlformats.org/drawingml/2006/main" xmlns:pic="http://schemas.openxmlformats.org/drawingml/2006/picture" xmlns:c="http://schemas.openxmlformats.org/drawingml/2006/chart" xmlns:lc="http://schemas.openxmlformats.org/drawingml/2006/lockedCanvas" xmlns:dgm="http://schemas.openxmlformats.org/drawingml/2006/diagram" xmlns:wps="http://schemas.microsoft.com/office/word/2010/wordprocessingShape" xmlns:wpg="http://schemas.microsoft.com/office/word/2010/wordprocessingGroup" xmlns:w14="http://schemas.microsoft.com/office/word/2010/wordml" xmlns:w15="http://schemas.microsoft.com/office/word/2012/wordml" xmlns:w16="http://schemas.microsoft.com/office/word/2018/wordml" xmlns:w16cex="http://schemas.microsoft.com/office/word/2018/wordml/cex" xmlns:w16cid="http://schemas.microsoft.com/office/word/2016/wordml/cid" xmlns="http://schemas.microsoft.com/office/tasks/2019/documenttasks" xmlns:cr="http://schemas.microsoft.com/office/comments/2020/reactions">
+  <w:p>
+    <w:pPr>
+      <w:rPr/>
+    </w:pPr>
+    <w:r>
+      <w:rPr/>
+      <w:drawing>
+        <wp:inline distB="114300" distT="114300" distL="114300" distR="114300">
+          <wp:extent cx="2238375" cy="547688"/>
+          <wp:effectExtent b="0" l="0" r="0" t="0"/>
+          <wp:docPr id="2" name="image2.png"/>
+          <a:graphic>
+            <a:graphicData uri="http://schemas.openxmlformats.org/drawingml/2006/picture">
+              <pic:pic>
+                <pic:nvPicPr>
+                  <pic:cNvPr id="0" name="image2.png"/>
+                  <pic:cNvPicPr preferRelativeResize="0"/>
+                </pic:nvPicPr>
+                <pic:blipFill>
+                  <a:blip r:embed="rId1"/>
+                  <a:srcRect b="0" l="0" r="0" t="0"/>
+                  <a:stretch>
+                    <a:fillRect/>
+                  </a:stretch>
+                </pic:blipFill>
+                <pic:spPr>
+                  <a:xfrm>
+                    <a:off x="0" y="0"/>
+                    <a:ext cx="2238375" cy="547688"/>
+                  </a:xfrm>
+                  <a:prstGeom prst="rect"/>
+                  <a:ln/>
+                </pic:spPr>
+              </pic:pic>
+            </a:graphicData>
+          </a:graphic>
+        </wp:inline>
+      </w:drawing>
+    </w:r>
+    <w:r>
+      <w:rPr>
+        <w:rtl w:val="0"/>
+      </w:rPr>
+    </w:r>
+  </w:p>
+  <w:p>
+    <w:pPr>
+      <w:rPr/>
+    </w:pPr>
+    <w:r>
+      <w:rPr>
+        <w:rtl w:val="0"/>
+      </w:rPr>
+    </w:r>
+  </w:p>
+</w:hdr>
 </file>
 
 <file path=word/numbering.xml><?xml version="1.0" encoding="utf-8"?>

</xml_diff>